<commit_message>
Atualiza geracao pedagogica e fluxos CDP
</commit_message>
<xml_diff>
--- a/MODELOEGLE.docx
+++ b/MODELOEGLE.docx
@@ -900,7 +900,14 @@
             <w:tcW w:w="907" w:type="dxa"/>
             <w:vAlign w:val="center"/>
           </w:tcPr>
-          <w:p/>
+          <w:p>
+            <w:pPr>
+              <w:jc w:val="center"/>
+            </w:pPr>
+            <w:r>
+              <w:t>1</w:t>
+            </w:r>
+          </w:p>
         </w:tc>
         <w:tc>
           <w:tcPr>
@@ -969,7 +976,11 @@
             <w:tcW w:w="907" w:type="dxa"/>
             <w:vAlign w:val="center"/>
           </w:tcPr>
-          <w:p/>
+          <w:p>
+            <w:r>
+              <w:t>2</w:t>
+            </w:r>
+          </w:p>
         </w:tc>
         <w:tc>
           <w:tcPr>
@@ -2049,7 +2060,11 @@
             <w:tcW w:w="907" w:type="dxa"/>
             <w:vAlign w:val="center"/>
           </w:tcPr>
-          <w:p/>
+          <w:p>
+            <w:r>
+              <w:t>3</w:t>
+            </w:r>
+          </w:p>
         </w:tc>
         <w:tc>
           <w:tcPr>
@@ -2118,7 +2133,11 @@
             <w:tcW w:w="907" w:type="dxa"/>
             <w:vAlign w:val="center"/>
           </w:tcPr>
-          <w:p/>
+          <w:p>
+            <w:r>
+              <w:t>4</w:t>
+            </w:r>
+          </w:p>
         </w:tc>
         <w:tc>
           <w:tcPr>
@@ -3221,7 +3240,11 @@
             <w:tcW w:w="907" w:type="dxa"/>
             <w:vAlign w:val="center"/>
           </w:tcPr>
-          <w:p/>
+          <w:p>
+            <w:r>
+              <w:t>5</w:t>
+            </w:r>
+          </w:p>
         </w:tc>
         <w:tc>
           <w:tcPr>
@@ -3290,7 +3313,11 @@
             <w:tcW w:w="907" w:type="dxa"/>
             <w:vAlign w:val="center"/>
           </w:tcPr>
-          <w:p/>
+          <w:p>
+            <w:r>
+              <w:t>6</w:t>
+            </w:r>
+          </w:p>
         </w:tc>
         <w:tc>
           <w:tcPr>
@@ -4345,7 +4372,11 @@
             <w:tcW w:w="907" w:type="dxa"/>
             <w:vAlign w:val="center"/>
           </w:tcPr>
-          <w:p/>
+          <w:p>
+            <w:r>
+              <w:t>7</w:t>
+            </w:r>
+          </w:p>
         </w:tc>
         <w:tc>
           <w:tcPr>
@@ -4414,7 +4445,11 @@
             <w:tcW w:w="907" w:type="dxa"/>
             <w:vAlign w:val="center"/>
           </w:tcPr>
-          <w:p/>
+          <w:p>
+            <w:r>
+              <w:t>8</w:t>
+            </w:r>
+          </w:p>
         </w:tc>
         <w:tc>
           <w:tcPr>
@@ -4665,6 +4700,1023 @@
         </w:rPr>
       </w:pPr>
     </w:p>
+    <w:p>
+      <w:pPr>
+        <w:spacing w:after="0"/>
+        <w:rPr>
+          <w:rFonts w:ascii="Arial" w:hAnsi="Arial" w:cs="Arial"/>
+          <w:b/>
+          <w:bCs/>
+          <w:sz w:val="20"/>
+          <w:szCs w:val="20"/>
+        </w:rPr>
+      </w:pPr>
+    </w:p>
+    <w:p>
+      <w:pPr>
+        <w:spacing w:after="0"/>
+        <w:rPr>
+          <w:rFonts w:ascii="Arial" w:hAnsi="Arial" w:cs="Arial"/>
+          <w:b/>
+          <w:bCs/>
+          <w:sz w:val="20"/>
+          <w:szCs w:val="20"/>
+        </w:rPr>
+      </w:pPr>
+    </w:p>
+    <w:tbl>
+      <w:tblPr>
+        <w:tblStyle w:val="TabeladeGrade4-nfase51"/>
+        <w:tblW w:w="0" w:type="auto"/>
+        <w:tblLook w:val="04A0" w:firstRow="1" w:lastRow="0" w:firstColumn="1" w:lastColumn="0" w:noHBand="0" w:noVBand="1"/>
+      </w:tblPr>
+      <w:tblGrid>
+        <w:gridCol w:w="1083"/>
+        <w:gridCol w:w="3025"/>
+        <w:gridCol w:w="2566"/>
+        <w:gridCol w:w="995"/>
+        <w:gridCol w:w="1772"/>
+        <w:gridCol w:w="1715"/>
+        <w:gridCol w:w="1376"/>
+        <w:gridCol w:w="1426"/>
+        <w:gridCol w:w="1430"/>
+      </w:tblGrid>
+      <w:tr>
+        <w:trPr>
+          <w:cnfStyle w:val="100000000000" w:firstRow="1" w:lastRow="0" w:firstColumn="0" w:lastColumn="0" w:oddVBand="0" w:evenVBand="0" w:oddHBand="0" w:evenHBand="0" w:firstRowFirstColumn="0" w:firstRowLastColumn="0" w:lastRowFirstColumn="0" w:lastRowLastColumn="0"/>
+          <w:trHeight w:val="382"/>
+        </w:trPr>
+        <w:tc>
+          <w:tcPr>
+            <w:cnfStyle w:val="001000000000" w:firstRow="0" w:lastRow="0" w:firstColumn="1" w:lastColumn="0" w:oddVBand="0" w:evenVBand="0" w:oddHBand="0" w:evenHBand="0" w:firstRowFirstColumn="0" w:firstRowLastColumn="0" w:lastRowFirstColumn="0" w:lastRowLastColumn="0"/>
+            <w:tcW w:w="15388" w:type="dxa"/>
+            <w:gridSpan w:val="9"/>
+            <w:tcBorders>
+              <w:top w:val="single" w:sz="4" w:space="0" w:color="9CC2E5" w:themeColor="accent5" w:themeTint="99"/>
+              <w:left w:val="single" w:sz="4" w:space="0" w:color="9CC2E5" w:themeColor="accent5" w:themeTint="99"/>
+              <w:bottom w:val="single" w:sz="4" w:space="0" w:color="9CC2E5" w:themeColor="accent5" w:themeTint="99"/>
+              <w:right w:val="single" w:sz="4" w:space="0" w:color="9CC2E5" w:themeColor="accent5" w:themeTint="99"/>
+            </w:tcBorders>
+            <w:vAlign w:val="center"/>
+          </w:tcPr>
+          <w:p>
+            <w:pPr>
+              <w:spacing w:after="80" w:line="276" w:lineRule="auto"/>
+              <w:jc w:val="center"/>
+              <w:rPr>
+                <w:rFonts w:ascii="Arial" w:hAnsi="Arial" w:cs="Arial"/>
+                <w:sz w:val="20"/>
+                <w:szCs w:val="20"/>
+              </w:rPr>
+            </w:pPr>
+            <w:r>
+              <w:rPr>
+                <w:rFonts w:ascii="Arial" w:hAnsi="Arial" w:cs="Arial"/>
+                <w:color w:val="000000"/>
+                <w:sz w:val="20"/>
+                <w:szCs w:val="20"/>
+              </w:rPr>
+              <w:t>PLANO DE AULAS</w:t>
+            </w:r>
+          </w:p>
+        </w:tc>
+      </w:tr>
+      <w:tr>
+        <w:trPr>
+          <w:cnfStyle w:val="000000100000" w:firstRow="0" w:lastRow="0" w:firstColumn="0" w:lastColumn="0" w:oddVBand="0" w:evenVBand="0" w:oddHBand="1" w:evenHBand="0" w:firstRowFirstColumn="0" w:firstRowLastColumn="0" w:lastRowFirstColumn="0" w:lastRowLastColumn="0"/>
+        </w:trPr>
+        <w:tc>
+          <w:tcPr>
+            <w:cnfStyle w:val="001000000000" w:firstRow="0" w:lastRow="0" w:firstColumn="1" w:lastColumn="0" w:oddVBand="0" w:evenVBand="0" w:oddHBand="0" w:evenHBand="0" w:firstRowFirstColumn="0" w:firstRowLastColumn="0" w:lastRowFirstColumn="0" w:lastRowLastColumn="0"/>
+            <w:tcW w:w="4108" w:type="dxa"/>
+            <w:gridSpan w:val="2"/>
+            <w:tcBorders>
+              <w:top w:val="single" w:sz="4" w:space="0" w:color="9CC2E5" w:themeColor="accent5" w:themeTint="99"/>
+            </w:tcBorders>
+            <w:vAlign w:val="center"/>
+          </w:tcPr>
+          <w:p>
+            <w:pPr>
+              <w:spacing w:after="80" w:line="276" w:lineRule="auto"/>
+              <w:jc w:val="center"/>
+              <w:rPr>
+                <w:rFonts w:ascii="Arial" w:hAnsi="Arial" w:cs="Arial"/>
+                <w:sz w:val="20"/>
+                <w:szCs w:val="20"/>
+              </w:rPr>
+            </w:pPr>
+            <w:r>
+              <w:rPr>
+                <w:rFonts w:ascii="Arial" w:hAnsi="Arial" w:cs="Arial"/>
+                <w:color w:val="000000"/>
+                <w:sz w:val="20"/>
+                <w:szCs w:val="20"/>
+              </w:rPr>
+              <w:t>ESCOLA</w:t>
+            </w:r>
+          </w:p>
+        </w:tc>
+        <w:tc>
+          <w:tcPr>
+            <w:tcW w:w="2566" w:type="dxa"/>
+            <w:tcBorders>
+              <w:top w:val="single" w:sz="4" w:space="0" w:color="9CC2E5" w:themeColor="accent5" w:themeTint="99"/>
+            </w:tcBorders>
+            <w:vAlign w:val="center"/>
+          </w:tcPr>
+          <w:p>
+            <w:pPr>
+              <w:spacing w:after="80" w:line="276" w:lineRule="auto"/>
+              <w:jc w:val="center"/>
+              <w:cnfStyle w:val="000000100000" w:firstRow="0" w:lastRow="0" w:firstColumn="0" w:lastColumn="0" w:oddVBand="0" w:evenVBand="0" w:oddHBand="1" w:evenHBand="0" w:firstRowFirstColumn="0" w:firstRowLastColumn="0" w:lastRowFirstColumn="0" w:lastRowLastColumn="0"/>
+              <w:rPr>
+                <w:rFonts w:ascii="Arial" w:hAnsi="Arial" w:cs="Arial"/>
+                <w:b/>
+                <w:bCs/>
+                <w:sz w:val="20"/>
+                <w:szCs w:val="20"/>
+              </w:rPr>
+            </w:pPr>
+            <w:r>
+              <w:rPr>
+                <w:rFonts w:ascii="Arial" w:hAnsi="Arial" w:cs="Arial"/>
+                <w:b/>
+                <w:bCs/>
+                <w:color w:val="000000"/>
+                <w:sz w:val="20"/>
+                <w:szCs w:val="20"/>
+              </w:rPr>
+              <w:t>PROFESSOR</w:t>
+            </w:r>
+          </w:p>
+        </w:tc>
+        <w:tc>
+          <w:tcPr>
+            <w:tcW w:w="4482" w:type="dxa"/>
+            <w:gridSpan w:val="3"/>
+            <w:tcBorders>
+              <w:top w:val="single" w:sz="4" w:space="0" w:color="9CC2E5" w:themeColor="accent5" w:themeTint="99"/>
+            </w:tcBorders>
+            <w:vAlign w:val="center"/>
+          </w:tcPr>
+          <w:p>
+            <w:pPr>
+              <w:spacing w:after="80" w:line="276" w:lineRule="auto"/>
+              <w:jc w:val="center"/>
+              <w:cnfStyle w:val="000000100000" w:firstRow="0" w:lastRow="0" w:firstColumn="0" w:lastColumn="0" w:oddVBand="0" w:evenVBand="0" w:oddHBand="1" w:evenHBand="0" w:firstRowFirstColumn="0" w:firstRowLastColumn="0" w:lastRowFirstColumn="0" w:lastRowLastColumn="0"/>
+              <w:rPr>
+                <w:rFonts w:ascii="Arial" w:hAnsi="Arial" w:cs="Arial"/>
+                <w:b/>
+                <w:bCs/>
+                <w:sz w:val="20"/>
+                <w:szCs w:val="20"/>
+              </w:rPr>
+            </w:pPr>
+            <w:r>
+              <w:rPr>
+                <w:rFonts w:ascii="Arial" w:hAnsi="Arial" w:cs="Arial"/>
+                <w:b/>
+                <w:bCs/>
+                <w:color w:val="000000"/>
+                <w:sz w:val="20"/>
+                <w:szCs w:val="20"/>
+              </w:rPr>
+              <w:t>COMPONENTE CURRICULAR</w:t>
+            </w:r>
+          </w:p>
+        </w:tc>
+        <w:tc>
+          <w:tcPr>
+            <w:tcW w:w="1376" w:type="dxa"/>
+            <w:tcBorders>
+              <w:top w:val="single" w:sz="4" w:space="0" w:color="9CC2E5" w:themeColor="accent5" w:themeTint="99"/>
+            </w:tcBorders>
+            <w:vAlign w:val="center"/>
+          </w:tcPr>
+          <w:p>
+            <w:pPr>
+              <w:spacing w:after="80" w:line="276" w:lineRule="auto"/>
+              <w:jc w:val="center"/>
+              <w:cnfStyle w:val="000000100000" w:firstRow="0" w:lastRow="0" w:firstColumn="0" w:lastColumn="0" w:oddVBand="0" w:evenVBand="0" w:oddHBand="1" w:evenHBand="0" w:firstRowFirstColumn="0" w:firstRowLastColumn="0" w:lastRowFirstColumn="0" w:lastRowLastColumn="0"/>
+              <w:rPr>
+                <w:rFonts w:ascii="Arial" w:hAnsi="Arial" w:cs="Arial"/>
+                <w:b/>
+                <w:bCs/>
+                <w:sz w:val="20"/>
+                <w:szCs w:val="20"/>
+              </w:rPr>
+            </w:pPr>
+            <w:r>
+              <w:rPr>
+                <w:rFonts w:ascii="Arial" w:hAnsi="Arial" w:cs="Arial"/>
+                <w:b/>
+                <w:bCs/>
+                <w:color w:val="000000"/>
+                <w:sz w:val="20"/>
+                <w:szCs w:val="20"/>
+              </w:rPr>
+              <w:t>TURMA</w:t>
+            </w:r>
+          </w:p>
+        </w:tc>
+        <w:tc>
+          <w:tcPr>
+            <w:tcW w:w="1426" w:type="dxa"/>
+            <w:tcBorders>
+              <w:top w:val="single" w:sz="4" w:space="0" w:color="9CC2E5" w:themeColor="accent5" w:themeTint="99"/>
+            </w:tcBorders>
+            <w:vAlign w:val="center"/>
+          </w:tcPr>
+          <w:p>
+            <w:pPr>
+              <w:spacing w:after="80" w:line="276" w:lineRule="auto"/>
+              <w:jc w:val="center"/>
+              <w:cnfStyle w:val="000000100000" w:firstRow="0" w:lastRow="0" w:firstColumn="0" w:lastColumn="0" w:oddVBand="0" w:evenVBand="0" w:oddHBand="1" w:evenHBand="0" w:firstRowFirstColumn="0" w:firstRowLastColumn="0" w:lastRowFirstColumn="0" w:lastRowLastColumn="0"/>
+              <w:rPr>
+                <w:rFonts w:ascii="Arial" w:hAnsi="Arial" w:cs="Arial"/>
+                <w:b/>
+                <w:bCs/>
+                <w:sz w:val="20"/>
+                <w:szCs w:val="20"/>
+              </w:rPr>
+            </w:pPr>
+            <w:r>
+              <w:rPr>
+                <w:rFonts w:ascii="Arial" w:hAnsi="Arial" w:cs="Arial"/>
+                <w:b/>
+                <w:bCs/>
+                <w:color w:val="000000"/>
+                <w:sz w:val="20"/>
+                <w:szCs w:val="20"/>
+              </w:rPr>
+              <w:t>MÊS</w:t>
+            </w:r>
+          </w:p>
+        </w:tc>
+        <w:tc>
+          <w:tcPr>
+            <w:tcW w:w="1430" w:type="dxa"/>
+            <w:tcBorders>
+              <w:top w:val="single" w:sz="4" w:space="0" w:color="9CC2E5" w:themeColor="accent5" w:themeTint="99"/>
+            </w:tcBorders>
+            <w:vAlign w:val="center"/>
+          </w:tcPr>
+          <w:p>
+            <w:pPr>
+              <w:spacing w:after="80" w:line="276" w:lineRule="auto"/>
+              <w:jc w:val="center"/>
+              <w:cnfStyle w:val="000000100000" w:firstRow="0" w:lastRow="0" w:firstColumn="0" w:lastColumn="0" w:oddVBand="0" w:evenVBand="0" w:oddHBand="1" w:evenHBand="0" w:firstRowFirstColumn="0" w:firstRowLastColumn="0" w:lastRowFirstColumn="0" w:lastRowLastColumn="0"/>
+              <w:rPr>
+                <w:rFonts w:ascii="Arial" w:hAnsi="Arial" w:cs="Arial"/>
+                <w:b/>
+                <w:bCs/>
+                <w:sz w:val="20"/>
+                <w:szCs w:val="20"/>
+              </w:rPr>
+            </w:pPr>
+            <w:r>
+              <w:rPr>
+                <w:rFonts w:ascii="Arial" w:hAnsi="Arial" w:cs="Arial"/>
+                <w:b/>
+                <w:bCs/>
+                <w:color w:val="000000"/>
+                <w:sz w:val="20"/>
+                <w:szCs w:val="20"/>
+              </w:rPr>
+              <w:t>BIMESTRE</w:t>
+            </w:r>
+          </w:p>
+        </w:tc>
+      </w:tr>
+      <w:tr>
+        <w:tc>
+          <w:tcPr>
+            <w:cnfStyle w:val="001000000000" w:firstRow="0" w:lastRow="0" w:firstColumn="1" w:lastColumn="0" w:oddVBand="0" w:evenVBand="0" w:oddHBand="0" w:evenHBand="0" w:firstRowFirstColumn="0" w:firstRowLastColumn="0" w:lastRowFirstColumn="0" w:lastRowLastColumn="0"/>
+            <w:tcW w:w="4108" w:type="dxa"/>
+            <w:gridSpan w:val="2"/>
+            <w:vAlign w:val="center"/>
+          </w:tcPr>
+          <w:p>
+            <w:pPr>
+              <w:spacing w:after="80" w:line="276" w:lineRule="auto"/>
+              <w:jc w:val="center"/>
+              <w:rPr>
+                <w:rFonts w:ascii="Arial" w:hAnsi="Arial" w:cs="Arial"/>
+                <w:sz w:val="20"/>
+                <w:szCs w:val="20"/>
+              </w:rPr>
+            </w:pPr>
+            <w:r>
+              <w:rPr>
+                <w:rFonts w:ascii="Arial" w:hAnsi="Arial" w:cs="Arial"/>
+                <w:color w:val="000000"/>
+                <w:sz w:val="20"/>
+                <w:szCs w:val="20"/>
+              </w:rPr>
+              <w:t>Prof.ª EGLE LUPORINI COSTA</w:t>
+            </w:r>
+          </w:p>
+        </w:tc>
+        <w:tc>
+          <w:tcPr>
+            <w:tcW w:w="2566" w:type="dxa"/>
+            <w:vAlign w:val="center"/>
+          </w:tcPr>
+          <w:p>
+            <w:pPr>
+              <w:cnfStyle w:val="000000000000" w:firstRow="0" w:lastRow="0" w:firstColumn="0" w:lastColumn="0" w:oddVBand="0" w:evenVBand="0" w:oddHBand="0" w:evenHBand="0" w:firstRowFirstColumn="0" w:firstRowLastColumn="0" w:lastRowFirstColumn="0" w:lastRowLastColumn="0"/>
+            </w:pPr>
+            <w:r>
+              <w:t>BEATRIZ RIBEIRO</w:t>
+            </w:r>
+          </w:p>
+        </w:tc>
+        <w:tc>
+          <w:tcPr>
+            <w:tcW w:w="4482" w:type="dxa"/>
+            <w:gridSpan w:val="3"/>
+            <w:vAlign w:val="center"/>
+          </w:tcPr>
+          <w:p>
+            <w:pPr>
+              <w:cnfStyle w:val="000000000000" w:firstRow="0" w:lastRow="0" w:firstColumn="0" w:lastColumn="0" w:oddVBand="0" w:evenVBand="0" w:oddHBand="0" w:evenHBand="0" w:firstRowFirstColumn="0" w:firstRowLastColumn="0" w:lastRowFirstColumn="0" w:lastRowLastColumn="0"/>
+            </w:pPr>
+            <w:r>
+              <w:t>Língua Portuguesa</w:t>
+            </w:r>
+          </w:p>
+        </w:tc>
+        <w:tc>
+          <w:tcPr>
+            <w:tcW w:w="1376" w:type="dxa"/>
+            <w:vAlign w:val="center"/>
+          </w:tcPr>
+          <w:p>
+            <w:pPr>
+              <w:cnfStyle w:val="000000000000" w:firstRow="0" w:lastRow="0" w:firstColumn="0" w:lastColumn="0" w:oddVBand="0" w:evenVBand="0" w:oddHBand="0" w:evenHBand="0" w:firstRowFirstColumn="0" w:firstRowLastColumn="0" w:lastRowFirstColumn="0" w:lastRowLastColumn="0"/>
+            </w:pPr>
+            <w:r>
+              <w:t>1º ANO C</w:t>
+            </w:r>
+          </w:p>
+        </w:tc>
+        <w:tc>
+          <w:tcPr>
+            <w:tcW w:w="1426" w:type="dxa"/>
+            <w:vAlign w:val="center"/>
+          </w:tcPr>
+          <w:p>
+            <w:pPr>
+              <w:cnfStyle w:val="000000000000" w:firstRow="0" w:lastRow="0" w:firstColumn="0" w:lastColumn="0" w:oddVBand="0" w:evenVBand="0" w:oddHBand="0" w:evenHBand="0" w:firstRowFirstColumn="0" w:firstRowLastColumn="0" w:lastRowFirstColumn="0" w:lastRowLastColumn="0"/>
+            </w:pPr>
+            <w:r>
+              <w:t>MAIO</w:t>
+            </w:r>
+          </w:p>
+        </w:tc>
+        <w:tc>
+          <w:tcPr>
+            <w:tcW w:w="1430" w:type="dxa"/>
+            <w:vAlign w:val="center"/>
+          </w:tcPr>
+          <w:p>
+            <w:pPr>
+              <w:cnfStyle w:val="000000000000" w:firstRow="0" w:lastRow="0" w:firstColumn="0" w:lastColumn="0" w:oddVBand="0" w:evenVBand="0" w:oddHBand="0" w:evenHBand="0" w:firstRowFirstColumn="0" w:firstRowLastColumn="0" w:lastRowFirstColumn="0" w:lastRowLastColumn="0"/>
+            </w:pPr>
+            <w:r>
+              <w:t>2°BIMESTRE</w:t>
+            </w:r>
+          </w:p>
+        </w:tc>
+      </w:tr>
+      <w:tr>
+        <w:trPr>
+          <w:cnfStyle w:val="000000100000" w:firstRow="0" w:lastRow="0" w:firstColumn="0" w:lastColumn="0" w:oddVBand="0" w:evenVBand="0" w:oddHBand="1" w:evenHBand="0" w:firstRowFirstColumn="0" w:firstRowLastColumn="0" w:lastRowFirstColumn="0" w:lastRowLastColumn="0"/>
+        </w:trPr>
+        <w:tc>
+          <w:tcPr>
+            <w:cnfStyle w:val="001000000000" w:firstRow="0" w:lastRow="0" w:firstColumn="1" w:lastColumn="0" w:oddVBand="0" w:evenVBand="0" w:oddHBand="0" w:evenHBand="0" w:firstRowFirstColumn="0" w:firstRowLastColumn="0" w:lastRowFirstColumn="0" w:lastRowLastColumn="0"/>
+            <w:tcW w:w="1083" w:type="dxa"/>
+            <w:shd w:val="clear" w:color="auto" w:fill="5B9BD5" w:themeFill="accent5"/>
+            <w:vAlign w:val="center"/>
+          </w:tcPr>
+          <w:p>
+            <w:pPr>
+              <w:spacing w:after="80" w:line="276" w:lineRule="auto"/>
+              <w:rPr>
+                <w:rFonts w:ascii="Arial" w:hAnsi="Arial" w:cs="Arial"/>
+                <w:sz w:val="20"/>
+                <w:szCs w:val="20"/>
+              </w:rPr>
+            </w:pPr>
+            <w:r>
+              <w:rPr>
+                <w:rFonts w:ascii="Arial" w:hAnsi="Arial" w:cs="Arial"/>
+                <w:color w:val="FFFFFF" w:themeColor="background1"/>
+                <w:sz w:val="20"/>
+                <w:szCs w:val="20"/>
+              </w:rPr>
+              <w:t>SEMANA</w:t>
+            </w:r>
+          </w:p>
+        </w:tc>
+        <w:tc>
+          <w:tcPr>
+            <w:tcW w:w="3025" w:type="dxa"/>
+            <w:vAlign w:val="center"/>
+          </w:tcPr>
+          <w:p>
+            <w:pPr>
+              <w:spacing w:after="80" w:line="276" w:lineRule="auto"/>
+              <w:jc w:val="center"/>
+              <w:cnfStyle w:val="000000100000" w:firstRow="0" w:lastRow="0" w:firstColumn="0" w:lastColumn="0" w:oddVBand="0" w:evenVBand="0" w:oddHBand="1" w:evenHBand="0" w:firstRowFirstColumn="0" w:firstRowLastColumn="0" w:lastRowFirstColumn="0" w:lastRowLastColumn="0"/>
+              <w:rPr>
+                <w:rFonts w:ascii="Arial" w:hAnsi="Arial" w:cs="Arial"/>
+                <w:sz w:val="20"/>
+                <w:szCs w:val="20"/>
+              </w:rPr>
+            </w:pPr>
+            <w:r>
+              <w:rPr>
+                <w:rFonts w:ascii="Arial" w:hAnsi="Arial" w:cs="Arial"/>
+                <w:color w:val="000000"/>
+                <w:sz w:val="20"/>
+                <w:szCs w:val="20"/>
+              </w:rPr>
+              <w:t>25/05 a 29/05</w:t>
+            </w:r>
+          </w:p>
+        </w:tc>
+        <w:tc>
+          <w:tcPr>
+            <w:tcW w:w="2566" w:type="dxa"/>
+            <w:shd w:val="clear" w:color="auto" w:fill="5B9BD5" w:themeFill="accent5"/>
+            <w:vAlign w:val="center"/>
+          </w:tcPr>
+          <w:p>
+            <w:pPr>
+              <w:spacing w:after="80" w:line="276" w:lineRule="auto"/>
+              <w:cnfStyle w:val="000000100000" w:firstRow="0" w:lastRow="0" w:firstColumn="0" w:lastColumn="0" w:oddVBand="0" w:evenVBand="0" w:oddHBand="1" w:evenHBand="0" w:firstRowFirstColumn="0" w:firstRowLastColumn="0" w:lastRowFirstColumn="0" w:lastRowLastColumn="0"/>
+              <w:rPr>
+                <w:rFonts w:ascii="Arial" w:hAnsi="Arial" w:cs="Arial"/>
+                <w:b/>
+                <w:bCs/>
+                <w:color w:val="FFFFFF" w:themeColor="background1"/>
+                <w:sz w:val="20"/>
+                <w:szCs w:val="20"/>
+              </w:rPr>
+            </w:pPr>
+            <w:r>
+              <w:rPr>
+                <w:rFonts w:ascii="Arial" w:hAnsi="Arial" w:cs="Arial"/>
+                <w:b/>
+                <w:bCs/>
+                <w:color w:val="FFFFFF" w:themeColor="background1"/>
+                <w:sz w:val="20"/>
+                <w:szCs w:val="20"/>
+              </w:rPr>
+              <w:t>AULAS PREVISTAS NA SEMANA</w:t>
+            </w:r>
+          </w:p>
+        </w:tc>
+        <w:tc>
+          <w:tcPr>
+            <w:tcW w:w="995" w:type="dxa"/>
+            <w:vAlign w:val="center"/>
+          </w:tcPr>
+          <w:p>
+            <w:pPr>
+              <w:spacing w:after="80" w:line="276" w:lineRule="auto"/>
+              <w:jc w:val="center"/>
+              <w:cnfStyle w:val="000000100000" w:firstRow="0" w:lastRow="0" w:firstColumn="0" w:lastColumn="0" w:oddVBand="0" w:evenVBand="0" w:oddHBand="1" w:evenHBand="0" w:firstRowFirstColumn="0" w:firstRowLastColumn="0" w:lastRowFirstColumn="0" w:lastRowLastColumn="0"/>
+              <w:rPr>
+                <w:rFonts w:ascii="Arial" w:hAnsi="Arial" w:cs="Arial"/>
+                <w:sz w:val="20"/>
+                <w:szCs w:val="20"/>
+              </w:rPr>
+            </w:pPr>
+            <w:r>
+              <w:rPr>
+                <w:rFonts w:ascii="Arial" w:hAnsi="Arial" w:cs="Arial"/>
+                <w:color w:val="000000"/>
+                <w:sz w:val="20"/>
+                <w:szCs w:val="20"/>
+              </w:rPr>
+              <w:t>4</w:t>
+            </w:r>
+          </w:p>
+        </w:tc>
+        <w:tc>
+          <w:tcPr>
+            <w:tcW w:w="1772" w:type="dxa"/>
+            <w:shd w:val="clear" w:color="auto" w:fill="5B9BD5" w:themeFill="accent5"/>
+            <w:vAlign w:val="center"/>
+          </w:tcPr>
+          <w:p>
+            <w:pPr>
+              <w:spacing w:after="80" w:line="276" w:lineRule="auto"/>
+              <w:cnfStyle w:val="000000100000" w:firstRow="0" w:lastRow="0" w:firstColumn="0" w:lastColumn="0" w:oddVBand="0" w:evenVBand="0" w:oddHBand="1" w:evenHBand="0" w:firstRowFirstColumn="0" w:firstRowLastColumn="0" w:lastRowFirstColumn="0" w:lastRowLastColumn="0"/>
+              <w:rPr>
+                <w:rFonts w:ascii="Arial" w:hAnsi="Arial" w:cs="Arial"/>
+                <w:b/>
+                <w:bCs/>
+                <w:color w:val="FFFFFF" w:themeColor="background1"/>
+                <w:sz w:val="20"/>
+                <w:szCs w:val="20"/>
+              </w:rPr>
+            </w:pPr>
+            <w:r>
+              <w:rPr>
+                <w:rFonts w:ascii="Arial" w:hAnsi="Arial" w:cs="Arial"/>
+                <w:b/>
+                <w:bCs/>
+                <w:color w:val="FFFFFF" w:themeColor="background1"/>
+                <w:sz w:val="20"/>
+                <w:szCs w:val="20"/>
+              </w:rPr>
+              <w:t>OBSERVAÇÕES</w:t>
+            </w:r>
+          </w:p>
+        </w:tc>
+        <w:tc>
+          <w:tcPr>
+            <w:tcW w:w="5947" w:type="dxa"/>
+            <w:gridSpan w:val="4"/>
+            <w:vAlign w:val="center"/>
+          </w:tcPr>
+          <w:p>
+            <w:pPr>
+              <w:spacing w:after="80" w:line="276" w:lineRule="auto"/>
+              <w:cnfStyle w:val="000000100000" w:firstRow="0" w:lastRow="0" w:firstColumn="0" w:lastColumn="0" w:oddVBand="0" w:evenVBand="0" w:oddHBand="1" w:evenHBand="0" w:firstRowFirstColumn="0" w:firstRowLastColumn="0" w:lastRowFirstColumn="0" w:lastRowLastColumn="0"/>
+              <w:rPr>
+                <w:rFonts w:ascii="Arial" w:hAnsi="Arial" w:cs="Arial"/>
+                <w:b/>
+                <w:bCs/>
+                <w:sz w:val="20"/>
+                <w:szCs w:val="20"/>
+              </w:rPr>
+            </w:pPr>
+            <w:r>
+              <w:rPr>
+                <w:rFonts w:ascii="Arial" w:hAnsi="Arial" w:cs="Arial"/>
+                <w:b/>
+                <w:bCs/>
+                <w:color w:val="000000"/>
+                <w:sz w:val="20"/>
+                <w:szCs w:val="20"/>
+              </w:rPr>
+              <w:t>O professor poderá realizar adequações neste plano de aula, sempre que necessário, em função do andamento das aulas, do ritmo da turma e das necessidades pedagógicas identificadas, preservando os objetivos de aprendizagem estabelecidos.</w:t>
+            </w:r>
+          </w:p>
+        </w:tc>
+      </w:tr>
+    </w:tbl>
+    <w:p>
+      <w:pPr>
+        <w:spacing w:after="0"/>
+        <w:rPr>
+          <w:rFonts w:ascii="Arial" w:hAnsi="Arial" w:cs="Arial"/>
+          <w:sz w:val="20"/>
+          <w:szCs w:val="20"/>
+        </w:rPr>
+      </w:pPr>
+    </w:p>
+    <w:tbl>
+      <w:tblPr>
+        <w:tblStyle w:val="TabeladeGrade4-nfase51"/>
+        <w:tblW w:w="15516" w:type="dxa"/>
+        <w:tblLayout w:type="fixed"/>
+        <w:tblLook w:val="04A0" w:firstRow="1" w:lastRow="0" w:firstColumn="1" w:lastColumn="0" w:noHBand="0" w:noVBand="1"/>
+      </w:tblPr>
+      <w:tblGrid>
+        <w:gridCol w:w="1057"/>
+        <w:gridCol w:w="1849"/>
+        <w:gridCol w:w="2046"/>
+        <w:gridCol w:w="6735"/>
+        <w:gridCol w:w="1848"/>
+        <w:gridCol w:w="1981"/>
+      </w:tblGrid>
+      <w:tr>
+        <w:trPr>
+          <w:cnfStyle w:val="100000000000" w:firstRow="1" w:lastRow="0" w:firstColumn="0" w:lastColumn="0" w:oddVBand="0" w:evenVBand="0" w:oddHBand="0" w:evenHBand="0" w:firstRowFirstColumn="0" w:firstRowLastColumn="0" w:lastRowFirstColumn="0" w:lastRowLastColumn="0"/>
+          <w:trHeight w:val="519"/>
+        </w:trPr>
+        <w:tc>
+          <w:tcPr>
+            <w:cnfStyle w:val="001000000000" w:firstRow="0" w:lastRow="0" w:firstColumn="1" w:lastColumn="0" w:oddVBand="0" w:evenVBand="0" w:oddHBand="0" w:evenHBand="0" w:firstRowFirstColumn="0" w:firstRowLastColumn="0" w:lastRowFirstColumn="0" w:lastRowLastColumn="0"/>
+            <w:tcW w:w="907" w:type="dxa"/>
+            <w:vAlign w:val="center"/>
+          </w:tcPr>
+          <w:p>
+            <w:pPr>
+              <w:spacing w:line="276" w:lineRule="auto"/>
+              <w:jc w:val="center"/>
+              <w:rPr>
+                <w:rFonts w:ascii="Arial" w:hAnsi="Arial" w:cs="Arial"/>
+                <w:b w:val="0"/>
+                <w:bCs w:val="0"/>
+                <w:sz w:val="20"/>
+                <w:szCs w:val="20"/>
+              </w:rPr>
+            </w:pPr>
+            <w:r>
+              <w:rPr>
+                <w:rFonts w:ascii="Arial" w:hAnsi="Arial" w:cs="Arial"/>
+                <w:color w:val="000000"/>
+                <w:sz w:val="16"/>
+                <w:szCs w:val="20"/>
+              </w:rPr>
+              <w:lastRenderedPageBreak/>
+              <w:t>AULA</w:t>
+            </w:r>
+          </w:p>
+          <w:p>
+            <w:pPr>
+              <w:spacing w:line="276" w:lineRule="auto"/>
+              <w:jc w:val="center"/>
+              <w:rPr>
+                <w:rFonts w:ascii="Arial" w:hAnsi="Arial" w:cs="Arial"/>
+                <w:b w:val="0"/>
+                <w:bCs w:val="0"/>
+                <w:sz w:val="20"/>
+                <w:szCs w:val="20"/>
+              </w:rPr>
+            </w:pPr>
+            <w:r>
+              <w:rPr>
+                <w:rFonts w:ascii="Arial" w:hAnsi="Arial" w:cs="Arial"/>
+                <w:color w:val="000000"/>
+                <w:sz w:val="16"/>
+                <w:szCs w:val="20"/>
+              </w:rPr>
+              <w:t>SEMANAL</w:t>
+            </w:r>
+          </w:p>
+          <w:p>
+            <w:pPr>
+              <w:spacing w:line="276" w:lineRule="auto"/>
+              <w:jc w:val="center"/>
+              <w:rPr>
+                <w:rFonts w:ascii="Arial" w:hAnsi="Arial" w:cs="Arial"/>
+                <w:sz w:val="20"/>
+                <w:szCs w:val="20"/>
+              </w:rPr>
+            </w:pPr>
+            <w:r>
+              <w:rPr>
+                <w:rFonts w:ascii="Arial" w:hAnsi="Arial" w:cs="Arial"/>
+                <w:color w:val="000000"/>
+                <w:sz w:val="16"/>
+                <w:szCs w:val="20"/>
+              </w:rPr>
+              <w:t>(Data e Horário)</w:t>
+            </w:r>
+          </w:p>
+        </w:tc>
+        <w:tc>
+          <w:tcPr>
+            <w:tcW w:w="1587" w:type="dxa"/>
+            <w:vAlign w:val="center"/>
+          </w:tcPr>
+          <w:p>
+            <w:pPr>
+              <w:spacing w:line="276" w:lineRule="auto"/>
+              <w:jc w:val="center"/>
+              <w:cnfStyle w:val="100000000000" w:firstRow="1" w:lastRow="0" w:firstColumn="0" w:lastColumn="0" w:oddVBand="0" w:evenVBand="0" w:oddHBand="0" w:evenHBand="0" w:firstRowFirstColumn="0" w:firstRowLastColumn="0" w:lastRowFirstColumn="0" w:lastRowLastColumn="0"/>
+              <w:rPr>
+                <w:rFonts w:ascii="Arial" w:hAnsi="Arial" w:cs="Arial"/>
+                <w:sz w:val="20"/>
+                <w:szCs w:val="20"/>
+              </w:rPr>
+            </w:pPr>
+            <w:r>
+              <w:rPr>
+                <w:rFonts w:ascii="Arial" w:hAnsi="Arial" w:cs="Arial"/>
+                <w:color w:val="000000"/>
+                <w:sz w:val="16"/>
+                <w:szCs w:val="20"/>
+              </w:rPr>
+              <w:t>NÚMERO E TÍTULO DO MATERIAL DIGITAL</w:t>
+            </w:r>
+          </w:p>
+        </w:tc>
+        <w:tc>
+          <w:tcPr>
+            <w:tcW w:w="1757" w:type="dxa"/>
+            <w:vAlign w:val="center"/>
+          </w:tcPr>
+          <w:p>
+            <w:pPr>
+              <w:spacing w:line="276" w:lineRule="auto"/>
+              <w:jc w:val="center"/>
+              <w:cnfStyle w:val="100000000000" w:firstRow="1" w:lastRow="0" w:firstColumn="0" w:lastColumn="0" w:oddVBand="0" w:evenVBand="0" w:oddHBand="0" w:evenHBand="0" w:firstRowFirstColumn="0" w:firstRowLastColumn="0" w:lastRowFirstColumn="0" w:lastRowLastColumn="0"/>
+              <w:rPr>
+                <w:rFonts w:ascii="Arial" w:hAnsi="Arial" w:cs="Arial"/>
+                <w:sz w:val="20"/>
+                <w:szCs w:val="20"/>
+              </w:rPr>
+            </w:pPr>
+            <w:r>
+              <w:rPr>
+                <w:rFonts w:ascii="Arial" w:hAnsi="Arial" w:cs="Arial"/>
+                <w:color w:val="000000"/>
+                <w:sz w:val="16"/>
+                <w:szCs w:val="20"/>
+              </w:rPr>
+              <w:t>APRENDIZAGEM ESSENCIAL*</w:t>
+            </w:r>
+          </w:p>
+        </w:tc>
+        <w:tc>
+          <w:tcPr>
+            <w:tcW w:w="5783" w:type="dxa"/>
+            <w:vAlign w:val="center"/>
+          </w:tcPr>
+          <w:p>
+            <w:pPr>
+              <w:jc w:val="center"/>
+              <w:cnfStyle w:val="100000000000" w:firstRow="1" w:lastRow="0" w:firstColumn="0" w:lastColumn="0" w:oddVBand="0" w:evenVBand="0" w:oddHBand="0" w:evenHBand="0" w:firstRowFirstColumn="0" w:firstRowLastColumn="0" w:lastRowFirstColumn="0" w:lastRowLastColumn="0"/>
+            </w:pPr>
+            <w:r>
+              <w:t>DESENVOLVIMENTO</w:t>
+            </w:r>
+          </w:p>
+        </w:tc>
+        <w:tc>
+          <w:tcPr>
+            <w:tcW w:w="1587" w:type="dxa"/>
+            <w:vAlign w:val="center"/>
+          </w:tcPr>
+          <w:p>
+            <w:pPr>
+              <w:spacing w:line="276" w:lineRule="auto"/>
+              <w:jc w:val="center"/>
+              <w:cnfStyle w:val="100000000000" w:firstRow="1" w:lastRow="0" w:firstColumn="0" w:lastColumn="0" w:oddVBand="0" w:evenVBand="0" w:oddHBand="0" w:evenHBand="0" w:firstRowFirstColumn="0" w:firstRowLastColumn="0" w:lastRowFirstColumn="0" w:lastRowLastColumn="0"/>
+              <w:rPr>
+                <w:rFonts w:ascii="Arial" w:hAnsi="Arial" w:cs="Arial"/>
+                <w:sz w:val="20"/>
+                <w:szCs w:val="20"/>
+              </w:rPr>
+            </w:pPr>
+            <w:r>
+              <w:rPr>
+                <w:rFonts w:ascii="Arial" w:hAnsi="Arial" w:cs="Arial"/>
+                <w:color w:val="000000"/>
+                <w:sz w:val="16"/>
+                <w:szCs w:val="20"/>
+              </w:rPr>
+              <w:t>ACOMPANHAMENTO DA APRENDIZAGEM</w:t>
+            </w:r>
+          </w:p>
+        </w:tc>
+        <w:tc>
+          <w:tcPr>
+            <w:tcW w:w="1701" w:type="dxa"/>
+            <w:vAlign w:val="center"/>
+          </w:tcPr>
+          <w:p>
+            <w:pPr>
+              <w:spacing w:line="276" w:lineRule="auto"/>
+              <w:jc w:val="center"/>
+              <w:cnfStyle w:val="100000000000" w:firstRow="1" w:lastRow="0" w:firstColumn="0" w:lastColumn="0" w:oddVBand="0" w:evenVBand="0" w:oddHBand="0" w:evenHBand="0" w:firstRowFirstColumn="0" w:firstRowLastColumn="0" w:lastRowFirstColumn="0" w:lastRowLastColumn="0"/>
+              <w:rPr>
+                <w:rFonts w:ascii="Arial" w:hAnsi="Arial" w:cs="Arial"/>
+                <w:sz w:val="20"/>
+                <w:szCs w:val="20"/>
+              </w:rPr>
+            </w:pPr>
+            <w:r>
+              <w:rPr>
+                <w:rFonts w:ascii="Arial" w:hAnsi="Arial" w:cs="Arial"/>
+                <w:color w:val="000000"/>
+                <w:sz w:val="16"/>
+                <w:szCs w:val="20"/>
+              </w:rPr>
+              <w:t>ACESSIBILIDADE</w:t>
+            </w:r>
+          </w:p>
+        </w:tc>
+      </w:tr>
+      <w:tr>
+        <w:trPr>
+          <w:cnfStyle w:val="000000100000" w:firstRow="0" w:lastRow="0" w:firstColumn="0" w:lastColumn="0" w:oddVBand="0" w:evenVBand="0" w:oddHBand="1" w:evenHBand="0" w:firstRowFirstColumn="0" w:firstRowLastColumn="0" w:lastRowFirstColumn="0" w:lastRowLastColumn="0"/>
+        </w:trPr>
+        <w:tc>
+          <w:tcPr>
+            <w:cnfStyle w:val="001000000000" w:firstRow="0" w:lastRow="0" w:firstColumn="1" w:lastColumn="0" w:oddVBand="0" w:evenVBand="0" w:oddHBand="0" w:evenHBand="0" w:firstRowFirstColumn="0" w:firstRowLastColumn="0" w:lastRowFirstColumn="0" w:lastRowLastColumn="0"/>
+            <w:tcW w:w="907" w:type="dxa"/>
+            <w:vAlign w:val="center"/>
+          </w:tcPr>
+          <w:p>
+            <w:pPr>
+              <w:jc w:val="center"/>
+            </w:pPr>
+          </w:p>
+        </w:tc>
+        <w:tc>
+          <w:tcPr>
+            <w:tcW w:w="1587" w:type="dxa"/>
+            <w:vAlign w:val="center"/>
+          </w:tcPr>
+          <w:p>
+            <w:pPr>
+              <w:jc w:val="center"/>
+              <w:cnfStyle w:val="000000100000" w:firstRow="0" w:lastRow="0" w:firstColumn="0" w:lastColumn="0" w:oddVBand="0" w:evenVBand="0" w:oddHBand="1" w:evenHBand="0" w:firstRowFirstColumn="0" w:firstRowLastColumn="0" w:lastRowFirstColumn="0" w:lastRowLastColumn="0"/>
+            </w:pPr>
+          </w:p>
+        </w:tc>
+        <w:tc>
+          <w:tcPr>
+            <w:tcW w:w="1757" w:type="dxa"/>
+            <w:vAlign w:val="center"/>
+          </w:tcPr>
+          <w:p>
+            <w:pPr>
+              <w:jc w:val="center"/>
+              <w:cnfStyle w:val="000000100000" w:firstRow="0" w:lastRow="0" w:firstColumn="0" w:lastColumn="0" w:oddVBand="0" w:evenVBand="0" w:oddHBand="1" w:evenHBand="0" w:firstRowFirstColumn="0" w:firstRowLastColumn="0" w:lastRowFirstColumn="0" w:lastRowLastColumn="0"/>
+            </w:pPr>
+          </w:p>
+        </w:tc>
+        <w:tc>
+          <w:tcPr>
+            <w:tcW w:w="5783" w:type="dxa"/>
+            <w:vAlign w:val="center"/>
+          </w:tcPr>
+          <w:p>
+            <w:pPr>
+              <w:cnfStyle w:val="000000100000" w:firstRow="0" w:lastRow="0" w:firstColumn="0" w:lastColumn="0" w:oddVBand="0" w:evenVBand="0" w:oddHBand="1" w:evenHBand="0" w:firstRowFirstColumn="0" w:firstRowLastColumn="0" w:lastRowFirstColumn="0" w:lastRowLastColumn="0"/>
+            </w:pPr>
+          </w:p>
+        </w:tc>
+        <w:tc>
+          <w:tcPr>
+            <w:tcW w:w="1587" w:type="dxa"/>
+            <w:vAlign w:val="center"/>
+          </w:tcPr>
+          <w:p>
+            <w:pPr>
+              <w:cnfStyle w:val="000000100000" w:firstRow="0" w:lastRow="0" w:firstColumn="0" w:lastColumn="0" w:oddVBand="0" w:evenVBand="0" w:oddHBand="1" w:evenHBand="0" w:firstRowFirstColumn="0" w:firstRowLastColumn="0" w:lastRowFirstColumn="0" w:lastRowLastColumn="0"/>
+            </w:pPr>
+          </w:p>
+        </w:tc>
+        <w:tc>
+          <w:tcPr>
+            <w:tcW w:w="1701" w:type="dxa"/>
+            <w:vAlign w:val="center"/>
+          </w:tcPr>
+          <w:p>
+            <w:pPr>
+              <w:cnfStyle w:val="000000100000" w:firstRow="0" w:lastRow="0" w:firstColumn="0" w:lastColumn="0" w:oddVBand="0" w:evenVBand="0" w:oddHBand="1" w:evenHBand="0" w:firstRowFirstColumn="0" w:firstRowLastColumn="0" w:lastRowFirstColumn="0" w:lastRowLastColumn="0"/>
+            </w:pPr>
+          </w:p>
+        </w:tc>
+      </w:tr>
+      <w:tr>
+        <w:trPr>
+          <w:trHeight w:val="724"/>
+        </w:trPr>
+        <w:tc>
+          <w:tcPr>
+            <w:cnfStyle w:val="001000000000" w:firstRow="0" w:lastRow="0" w:firstColumn="1" w:lastColumn="0" w:oddVBand="0" w:evenVBand="0" w:oddHBand="0" w:evenHBand="0" w:firstRowFirstColumn="0" w:firstRowLastColumn="0" w:lastRowFirstColumn="0" w:lastRowLastColumn="0"/>
+            <w:tcW w:w="907" w:type="dxa"/>
+            <w:vAlign w:val="center"/>
+          </w:tcPr>
+          <w:p>
+            <w:r>
+              <w:t>9</w:t>
+            </w:r>
+          </w:p>
+        </w:tc>
+        <w:tc>
+          <w:tcPr>
+            <w:tcW w:w="1587" w:type="dxa"/>
+            <w:vAlign w:val="center"/>
+          </w:tcPr>
+          <w:p>
+            <w:pPr>
+              <w:cnfStyle w:val="000000000000" w:firstRow="0" w:lastRow="0" w:firstColumn="0" w:lastColumn="0" w:oddVBand="0" w:evenVBand="0" w:oddHBand="0" w:evenHBand="0" w:firstRowFirstColumn="0" w:firstRowLastColumn="0" w:lastRowFirstColumn="0" w:lastRowLastColumn="0"/>
+            </w:pPr>
+          </w:p>
+        </w:tc>
+        <w:tc>
+          <w:tcPr>
+            <w:tcW w:w="1757" w:type="dxa"/>
+            <w:vAlign w:val="center"/>
+          </w:tcPr>
+          <w:p>
+            <w:pPr>
+              <w:cnfStyle w:val="000000000000" w:firstRow="0" w:lastRow="0" w:firstColumn="0" w:lastColumn="0" w:oddVBand="0" w:evenVBand="0" w:oddHBand="0" w:evenHBand="0" w:firstRowFirstColumn="0" w:firstRowLastColumn="0" w:lastRowFirstColumn="0" w:lastRowLastColumn="0"/>
+            </w:pPr>
+          </w:p>
+        </w:tc>
+        <w:tc>
+          <w:tcPr>
+            <w:tcW w:w="5783" w:type="dxa"/>
+            <w:vAlign w:val="center"/>
+          </w:tcPr>
+          <w:p>
+            <w:pPr>
+              <w:cnfStyle w:val="000000000000" w:firstRow="0" w:lastRow="0" w:firstColumn="0" w:lastColumn="0" w:oddVBand="0" w:evenVBand="0" w:oddHBand="0" w:evenHBand="0" w:firstRowFirstColumn="0" w:firstRowLastColumn="0" w:lastRowFirstColumn="0" w:lastRowLastColumn="0"/>
+            </w:pPr>
+          </w:p>
+        </w:tc>
+        <w:tc>
+          <w:tcPr>
+            <w:tcW w:w="1587" w:type="dxa"/>
+            <w:vAlign w:val="center"/>
+          </w:tcPr>
+          <w:p>
+            <w:pPr>
+              <w:cnfStyle w:val="000000000000" w:firstRow="0" w:lastRow="0" w:firstColumn="0" w:lastColumn="0" w:oddVBand="0" w:evenVBand="0" w:oddHBand="0" w:evenHBand="0" w:firstRowFirstColumn="0" w:firstRowLastColumn="0" w:lastRowFirstColumn="0" w:lastRowLastColumn="0"/>
+            </w:pPr>
+          </w:p>
+        </w:tc>
+        <w:tc>
+          <w:tcPr>
+            <w:tcW w:w="1701" w:type="dxa"/>
+            <w:vAlign w:val="center"/>
+          </w:tcPr>
+          <w:p>
+            <w:pPr>
+              <w:cnfStyle w:val="000000000000" w:firstRow="0" w:lastRow="0" w:firstColumn="0" w:lastColumn="0" w:oddVBand="0" w:evenVBand="0" w:oddHBand="0" w:evenHBand="0" w:firstRowFirstColumn="0" w:firstRowLastColumn="0" w:lastRowFirstColumn="0" w:lastRowLastColumn="0"/>
+            </w:pPr>
+          </w:p>
+        </w:tc>
+      </w:tr>
+      <w:tr>
+        <w:trPr>
+          <w:cnfStyle w:val="000000100000" w:firstRow="0" w:lastRow="0" w:firstColumn="0" w:lastColumn="0" w:oddVBand="0" w:evenVBand="0" w:oddHBand="1" w:evenHBand="0" w:firstRowFirstColumn="0" w:firstRowLastColumn="0" w:lastRowFirstColumn="0" w:lastRowLastColumn="0"/>
+          <w:trHeight w:val="774"/>
+        </w:trPr>
+        <w:tc>
+          <w:tcPr>
+            <w:cnfStyle w:val="001000000000" w:firstRow="0" w:lastRow="0" w:firstColumn="1" w:lastColumn="0" w:oddVBand="0" w:evenVBand="0" w:oddHBand="0" w:evenHBand="0" w:firstRowFirstColumn="0" w:firstRowLastColumn="0" w:lastRowFirstColumn="0" w:lastRowLastColumn="0"/>
+            <w:tcW w:w="907" w:type="dxa"/>
+            <w:vAlign w:val="center"/>
+          </w:tcPr>
+          <w:p>
+            <w:r>
+              <w:t>10</w:t>
+            </w:r>
+          </w:p>
+        </w:tc>
+        <w:tc>
+          <w:tcPr>
+            <w:tcW w:w="1587" w:type="dxa"/>
+            <w:vAlign w:val="center"/>
+          </w:tcPr>
+          <w:p>
+            <w:pPr>
+              <w:cnfStyle w:val="000000100000" w:firstRow="0" w:lastRow="0" w:firstColumn="0" w:lastColumn="0" w:oddVBand="0" w:evenVBand="0" w:oddHBand="1" w:evenHBand="0" w:firstRowFirstColumn="0" w:firstRowLastColumn="0" w:lastRowFirstColumn="0" w:lastRowLastColumn="0"/>
+            </w:pPr>
+          </w:p>
+        </w:tc>
+        <w:tc>
+          <w:tcPr>
+            <w:tcW w:w="1757" w:type="dxa"/>
+            <w:vAlign w:val="center"/>
+          </w:tcPr>
+          <w:p>
+            <w:pPr>
+              <w:cnfStyle w:val="000000100000" w:firstRow="0" w:lastRow="0" w:firstColumn="0" w:lastColumn="0" w:oddVBand="0" w:evenVBand="0" w:oddHBand="1" w:evenHBand="0" w:firstRowFirstColumn="0" w:firstRowLastColumn="0" w:lastRowFirstColumn="0" w:lastRowLastColumn="0"/>
+            </w:pPr>
+          </w:p>
+        </w:tc>
+        <w:tc>
+          <w:tcPr>
+            <w:tcW w:w="5783" w:type="dxa"/>
+            <w:vAlign w:val="center"/>
+          </w:tcPr>
+          <w:p>
+            <w:pPr>
+              <w:cnfStyle w:val="000000100000" w:firstRow="0" w:lastRow="0" w:firstColumn="0" w:lastColumn="0" w:oddVBand="0" w:evenVBand="0" w:oddHBand="1" w:evenHBand="0" w:firstRowFirstColumn="0" w:firstRowLastColumn="0" w:lastRowFirstColumn="0" w:lastRowLastColumn="0"/>
+            </w:pPr>
+          </w:p>
+        </w:tc>
+        <w:tc>
+          <w:tcPr>
+            <w:tcW w:w="1587" w:type="dxa"/>
+            <w:vAlign w:val="center"/>
+          </w:tcPr>
+          <w:p>
+            <w:pPr>
+              <w:cnfStyle w:val="000000100000" w:firstRow="0" w:lastRow="0" w:firstColumn="0" w:lastColumn="0" w:oddVBand="0" w:evenVBand="0" w:oddHBand="1" w:evenHBand="0" w:firstRowFirstColumn="0" w:firstRowLastColumn="0" w:lastRowFirstColumn="0" w:lastRowLastColumn="0"/>
+            </w:pPr>
+          </w:p>
+        </w:tc>
+        <w:tc>
+          <w:tcPr>
+            <w:tcW w:w="1701" w:type="dxa"/>
+            <w:vAlign w:val="center"/>
+          </w:tcPr>
+          <w:p>
+            <w:pPr>
+              <w:cnfStyle w:val="000000100000" w:firstRow="0" w:lastRow="0" w:firstColumn="0" w:lastColumn="0" w:oddVBand="0" w:evenVBand="0" w:oddHBand="1" w:evenHBand="0" w:firstRowFirstColumn="0" w:firstRowLastColumn="0" w:lastRowFirstColumn="0" w:lastRowLastColumn="0"/>
+            </w:pPr>
+          </w:p>
+        </w:tc>
+      </w:tr>
+    </w:tbl>
     <w:p>
       <w:pPr>
         <w:spacing w:after="0"/>
@@ -6146,7 +7198,7 @@
   <w:style w:type="paragraph" w:default="1" w:styleId="Normal">
     <w:name w:val="Normal"/>
     <w:qFormat/>
-    <w:rsid w:val="00C13CB8"/>
+    <w:rsid w:val="00814BF9"/>
   </w:style>
   <w:style w:type="paragraph" w:styleId="Ttulo1">
     <w:name w:val="heading 1"/>

</xml_diff>